<commit_message>
apache kafka and reliable outbox patterns
</commit_message>
<xml_diff>
--- a/1 - Backend architectures.docx
+++ b/1 - Backend architectures.docx
@@ -43,7 +43,15 @@
           <w:sz w:val="40"/>
           <w:szCs w:val="36"/>
         </w:rPr>
-        <w:t>BACKEND NOTES</w:t>
+        <w:t xml:space="preserve">BACKEND </w:t>
+      </w:r>
+      <w:r>
+        <w:rPr>
+          <w:b/>
+          <w:sz w:val="40"/>
+          <w:szCs w:val="36"/>
+        </w:rPr>
+        <w:t>ARCHITECTURES</w:t>
       </w:r>
     </w:p>
     <w:p>
@@ -116,7 +124,7 @@
           <w:r>
             <w:fldChar w:fldCharType="separate"/>
           </w:r>
-          <w:hyperlink w:anchor="_Toc240624439" w:history="1">
+          <w:hyperlink w:anchor="_Toc240631027" w:history="1">
             <w:r>
               <w:rPr>
                 <w:rStyle w:val="Hyperlink"/>
@@ -143,7 +151,7 @@
                 <w:noProof/>
                 <w:webHidden/>
               </w:rPr>
-              <w:instrText xml:space="preserve"> PAGEREF _Toc240624439 \h </w:instrText>
+              <w:instrText xml:space="preserve"> PAGEREF _Toc240631027 \h </w:instrText>
             </w:r>
             <w:r>
               <w:rPr>
@@ -188,7 +196,7 @@
               <w14:ligatures w14:val="standardContextual"/>
             </w:rPr>
           </w:pPr>
-          <w:hyperlink w:anchor="_Toc240624440" w:history="1">
+          <w:hyperlink w:anchor="_Toc240631028" w:history="1">
             <w:r>
               <w:rPr>
                 <w:rStyle w:val="Hyperlink"/>
@@ -215,7 +223,7 @@
                 <w:noProof/>
                 <w:webHidden/>
               </w:rPr>
-              <w:instrText xml:space="preserve"> PAGEREF _Toc240624440 \h </w:instrText>
+              <w:instrText xml:space="preserve"> PAGEREF _Toc240631028 \h </w:instrText>
             </w:r>
             <w:r>
               <w:rPr>
@@ -260,7 +268,7 @@
               <w14:ligatures w14:val="standardContextual"/>
             </w:rPr>
           </w:pPr>
-          <w:hyperlink w:anchor="_Toc240624441" w:history="1">
+          <w:hyperlink w:anchor="_Toc240631029" w:history="1">
             <w:r>
               <w:rPr>
                 <w:rStyle w:val="Hyperlink"/>
@@ -287,7 +295,7 @@
                 <w:noProof/>
                 <w:webHidden/>
               </w:rPr>
-              <w:instrText xml:space="preserve"> PAGEREF _Toc240624441 \h </w:instrText>
+              <w:instrText xml:space="preserve"> PAGEREF _Toc240631029 \h </w:instrText>
             </w:r>
             <w:r>
               <w:rPr>
@@ -332,7 +340,7 @@
               <w14:ligatures w14:val="standardContextual"/>
             </w:rPr>
           </w:pPr>
-          <w:hyperlink w:anchor="_Toc240624442" w:history="1">
+          <w:hyperlink w:anchor="_Toc240631030" w:history="1">
             <w:r>
               <w:rPr>
                 <w:rStyle w:val="Hyperlink"/>
@@ -359,7 +367,7 @@
                 <w:noProof/>
                 <w:webHidden/>
               </w:rPr>
-              <w:instrText xml:space="preserve"> PAGEREF _Toc240624442 \h </w:instrText>
+              <w:instrText xml:space="preserve"> PAGEREF _Toc240631030 \h </w:instrText>
             </w:r>
             <w:r>
               <w:rPr>
@@ -404,7 +412,7 @@
               <w14:ligatures w14:val="standardContextual"/>
             </w:rPr>
           </w:pPr>
-          <w:hyperlink w:anchor="_Toc240624443" w:history="1">
+          <w:hyperlink w:anchor="_Toc240631031" w:history="1">
             <w:r>
               <w:rPr>
                 <w:rStyle w:val="Hyperlink"/>
@@ -431,7 +439,7 @@
                 <w:noProof/>
                 <w:webHidden/>
               </w:rPr>
-              <w:instrText xml:space="preserve"> PAGEREF _Toc240624443 \h </w:instrText>
+              <w:instrText xml:space="preserve"> PAGEREF _Toc240631031 \h </w:instrText>
             </w:r>
             <w:r>
               <w:rPr>
@@ -476,7 +484,7 @@
               <w14:ligatures w14:val="standardContextual"/>
             </w:rPr>
           </w:pPr>
-          <w:hyperlink w:anchor="_Toc240624444" w:history="1">
+          <w:hyperlink w:anchor="_Toc240631032" w:history="1">
             <w:r>
               <w:rPr>
                 <w:rStyle w:val="Hyperlink"/>
@@ -503,7 +511,7 @@
                 <w:noProof/>
                 <w:webHidden/>
               </w:rPr>
-              <w:instrText xml:space="preserve"> PAGEREF _Toc240624444 \h </w:instrText>
+              <w:instrText xml:space="preserve"> PAGEREF _Toc240631032 \h </w:instrText>
             </w:r>
             <w:r>
               <w:rPr>
@@ -548,27 +556,13 @@
               <w14:ligatures w14:val="standardContextual"/>
             </w:rPr>
           </w:pPr>
-          <w:hyperlink w:anchor="_Toc240624445" w:history="1">
+          <w:hyperlink w:anchor="_Toc240631033" w:history="1">
             <w:r>
               <w:rPr>
                 <w:rStyle w:val="Hyperlink"/>
                 <w:noProof/>
               </w:rPr>
-              <w:t>Why compani</w:t>
-            </w:r>
-            <w:r>
-              <w:rPr>
-                <w:rStyle w:val="Hyperlink"/>
-                <w:noProof/>
-              </w:rPr>
-              <w:t>e</w:t>
-            </w:r>
-            <w:r>
-              <w:rPr>
-                <w:rStyle w:val="Hyperlink"/>
-                <w:noProof/>
-              </w:rPr>
-              <w:t>s accept microservice complexity</w:t>
+              <w:t>Why companies accept microservice complexity</w:t>
             </w:r>
             <w:r>
               <w:rPr>
@@ -589,7 +583,7 @@
                 <w:noProof/>
                 <w:webHidden/>
               </w:rPr>
-              <w:instrText xml:space="preserve"> PAGEREF _Toc240624445 \h </w:instrText>
+              <w:instrText xml:space="preserve"> PAGEREF _Toc240631033 \h </w:instrText>
             </w:r>
             <w:r>
               <w:rPr>
@@ -634,7 +628,7 @@
               <w14:ligatures w14:val="standardContextual"/>
             </w:rPr>
           </w:pPr>
-          <w:hyperlink w:anchor="_Toc240624446" w:history="1">
+          <w:hyperlink w:anchor="_Toc240631034" w:history="1">
             <w:r>
               <w:rPr>
                 <w:rStyle w:val="Hyperlink"/>
@@ -661,7 +655,7 @@
                 <w:noProof/>
                 <w:webHidden/>
               </w:rPr>
-              <w:instrText xml:space="preserve"> PAGEREF _Toc240624446 \h </w:instrText>
+              <w:instrText xml:space="preserve"> PAGEREF _Toc240631034 \h </w:instrText>
             </w:r>
             <w:r>
               <w:rPr>
@@ -706,7 +700,7 @@
               <w14:ligatures w14:val="standardContextual"/>
             </w:rPr>
           </w:pPr>
-          <w:hyperlink w:anchor="_Toc240624447" w:history="1">
+          <w:hyperlink w:anchor="_Toc240631035" w:history="1">
             <w:r>
               <w:rPr>
                 <w:rStyle w:val="Hyperlink"/>
@@ -733,7 +727,7 @@
                 <w:noProof/>
                 <w:webHidden/>
               </w:rPr>
-              <w:instrText xml:space="preserve"> PAGEREF _Toc240624447 \h </w:instrText>
+              <w:instrText xml:space="preserve"> PAGEREF _Toc240631035 \h </w:instrText>
             </w:r>
             <w:r>
               <w:rPr>
@@ -778,7 +772,7 @@
               <w14:ligatures w14:val="standardContextual"/>
             </w:rPr>
           </w:pPr>
-          <w:hyperlink w:anchor="_Toc240624448" w:history="1">
+          <w:hyperlink w:anchor="_Toc240631036" w:history="1">
             <w:r>
               <w:rPr>
                 <w:rStyle w:val="Hyperlink"/>
@@ -805,7 +799,7 @@
                 <w:noProof/>
                 <w:webHidden/>
               </w:rPr>
-              <w:instrText xml:space="preserve"> PAGEREF _Toc240624448 \h </w:instrText>
+              <w:instrText xml:space="preserve"> PAGEREF _Toc240631036 \h </w:instrText>
             </w:r>
             <w:r>
               <w:rPr>
@@ -850,7 +844,7 @@
               <w14:ligatures w14:val="standardContextual"/>
             </w:rPr>
           </w:pPr>
-          <w:hyperlink w:anchor="_Toc240624449" w:history="1">
+          <w:hyperlink w:anchor="_Toc240631037" w:history="1">
             <w:r>
               <w:rPr>
                 <w:rStyle w:val="Hyperlink"/>
@@ -877,7 +871,7 @@
                 <w:noProof/>
                 <w:webHidden/>
               </w:rPr>
-              <w:instrText xml:space="preserve"> PAGEREF _Toc240624449 \h </w:instrText>
+              <w:instrText xml:space="preserve"> PAGEREF _Toc240631037 \h </w:instrText>
             </w:r>
             <w:r>
               <w:rPr>
@@ -922,7 +916,7 @@
               <w14:ligatures w14:val="standardContextual"/>
             </w:rPr>
           </w:pPr>
-          <w:hyperlink w:anchor="_Toc240624450" w:history="1">
+          <w:hyperlink w:anchor="_Toc240631038" w:history="1">
             <w:r>
               <w:rPr>
                 <w:rStyle w:val="Hyperlink"/>
@@ -949,7 +943,7 @@
                 <w:noProof/>
                 <w:webHidden/>
               </w:rPr>
-              <w:instrText xml:space="preserve"> PAGEREF _Toc240624450 \h </w:instrText>
+              <w:instrText xml:space="preserve"> PAGEREF _Toc240631038 \h </w:instrText>
             </w:r>
             <w:r>
               <w:rPr>
@@ -994,7 +988,7 @@
               <w14:ligatures w14:val="standardContextual"/>
             </w:rPr>
           </w:pPr>
-          <w:hyperlink w:anchor="_Toc240624451" w:history="1">
+          <w:hyperlink w:anchor="_Toc240631039" w:history="1">
             <w:r>
               <w:rPr>
                 <w:rStyle w:val="Hyperlink"/>
@@ -1021,7 +1015,7 @@
                 <w:noProof/>
                 <w:webHidden/>
               </w:rPr>
-              <w:instrText xml:space="preserve"> PAGEREF _Toc240624451 \h </w:instrText>
+              <w:instrText xml:space="preserve"> PAGEREF _Toc240631039 \h </w:instrText>
             </w:r>
             <w:r>
               <w:rPr>
@@ -1066,7 +1060,7 @@
               <w14:ligatures w14:val="standardContextual"/>
             </w:rPr>
           </w:pPr>
-          <w:hyperlink w:anchor="_Toc240624452" w:history="1">
+          <w:hyperlink w:anchor="_Toc240631040" w:history="1">
             <w:r>
               <w:rPr>
                 <w:rStyle w:val="Hyperlink"/>
@@ -1093,7 +1087,7 @@
                 <w:noProof/>
                 <w:webHidden/>
               </w:rPr>
-              <w:instrText xml:space="preserve"> PAGEREF _Toc240624452 \h </w:instrText>
+              <w:instrText xml:space="preserve"> PAGEREF _Toc240631040 \h </w:instrText>
             </w:r>
             <w:r>
               <w:rPr>
@@ -1138,7 +1132,7 @@
               <w14:ligatures w14:val="standardContextual"/>
             </w:rPr>
           </w:pPr>
-          <w:hyperlink w:anchor="_Toc240624453" w:history="1">
+          <w:hyperlink w:anchor="_Toc240631041" w:history="1">
             <w:r>
               <w:rPr>
                 <w:rStyle w:val="Hyperlink"/>
@@ -1165,7 +1159,7 @@
                 <w:noProof/>
                 <w:webHidden/>
               </w:rPr>
-              <w:instrText xml:space="preserve"> PAGEREF _Toc240624453 \h </w:instrText>
+              <w:instrText xml:space="preserve"> PAGEREF _Toc240631041 \h </w:instrText>
             </w:r>
             <w:r>
               <w:rPr>
@@ -1210,7 +1204,7 @@
               <w14:ligatures w14:val="standardContextual"/>
             </w:rPr>
           </w:pPr>
-          <w:hyperlink w:anchor="_Toc240624454" w:history="1">
+          <w:hyperlink w:anchor="_Toc240631042" w:history="1">
             <w:r>
               <w:rPr>
                 <w:rStyle w:val="Hyperlink"/>
@@ -1237,7 +1231,7 @@
                 <w:noProof/>
                 <w:webHidden/>
               </w:rPr>
-              <w:instrText xml:space="preserve"> PAGEREF _Toc240624454 \h </w:instrText>
+              <w:instrText xml:space="preserve"> PAGEREF _Toc240631042 \h </w:instrText>
             </w:r>
             <w:r>
               <w:rPr>
@@ -1282,7 +1276,7 @@
               <w14:ligatures w14:val="standardContextual"/>
             </w:rPr>
           </w:pPr>
-          <w:hyperlink w:anchor="_Toc240624455" w:history="1">
+          <w:hyperlink w:anchor="_Toc240631043" w:history="1">
             <w:r>
               <w:rPr>
                 <w:rStyle w:val="Hyperlink"/>
@@ -1309,7 +1303,7 @@
                 <w:noProof/>
                 <w:webHidden/>
               </w:rPr>
-              <w:instrText xml:space="preserve"> PAGEREF _Toc240624455 \h </w:instrText>
+              <w:instrText xml:space="preserve"> PAGEREF _Toc240631043 \h </w:instrText>
             </w:r>
             <w:r>
               <w:rPr>
@@ -1354,7 +1348,7 @@
               <w14:ligatures w14:val="standardContextual"/>
             </w:rPr>
           </w:pPr>
-          <w:hyperlink w:anchor="_Toc240624456" w:history="1">
+          <w:hyperlink w:anchor="_Toc240631044" w:history="1">
             <w:r>
               <w:rPr>
                 <w:rStyle w:val="Hyperlink"/>
@@ -1381,7 +1375,7 @@
                 <w:noProof/>
                 <w:webHidden/>
               </w:rPr>
-              <w:instrText xml:space="preserve"> PAGEREF _Toc240624456 \h </w:instrText>
+              <w:instrText xml:space="preserve"> PAGEREF _Toc240631044 \h </w:instrText>
             </w:r>
             <w:r>
               <w:rPr>
@@ -1426,7 +1420,7 @@
               <w14:ligatures w14:val="standardContextual"/>
             </w:rPr>
           </w:pPr>
-          <w:hyperlink w:anchor="_Toc240624457" w:history="1">
+          <w:hyperlink w:anchor="_Toc240631045" w:history="1">
             <w:r>
               <w:rPr>
                 <w:rStyle w:val="Hyperlink"/>
@@ -1453,7 +1447,7 @@
                 <w:noProof/>
                 <w:webHidden/>
               </w:rPr>
-              <w:instrText xml:space="preserve"> PAGEREF _Toc240624457 \h </w:instrText>
+              <w:instrText xml:space="preserve"> PAGEREF _Toc240631045 \h </w:instrText>
             </w:r>
             <w:r>
               <w:rPr>
@@ -1517,7 +1511,7 @@
       <w:pPr>
         <w:pStyle w:val="Heading1"/>
       </w:pPr>
-      <w:bookmarkStart w:id="0" w:name="_Toc240624439"/>
+      <w:bookmarkStart w:id="0" w:name="_Toc240631027"/>
       <w:r>
         <w:lastRenderedPageBreak/>
         <w:t>BACKEND ARCHITECTURE FUNDAMENTALS</w:t>
@@ -1583,7 +1577,7 @@
       <w:pPr>
         <w:pStyle w:val="Heading2"/>
       </w:pPr>
-      <w:bookmarkStart w:id="1" w:name="_Toc240624440"/>
+      <w:bookmarkStart w:id="1" w:name="_Toc240631028"/>
       <w:r>
         <w:t>1. Architecture models</w:t>
       </w:r>
@@ -1652,7 +1646,7 @@
       <w:pPr>
         <w:pStyle w:val="Heading3"/>
       </w:pPr>
-      <w:bookmarkStart w:id="2" w:name="_Toc240624441"/>
+      <w:bookmarkStart w:id="2" w:name="_Toc240631029"/>
       <w:r>
         <w:t>Monolith</w:t>
       </w:r>
@@ -1698,7 +1692,7 @@
       <w:pPr>
         <w:pStyle w:val="Heading3"/>
       </w:pPr>
-      <w:bookmarkStart w:id="3" w:name="_Toc240624442"/>
+      <w:bookmarkStart w:id="3" w:name="_Toc240631030"/>
       <w:r>
         <w:t>Modular monolith</w:t>
       </w:r>
@@ -1763,7 +1757,7 @@
       <w:pPr>
         <w:pStyle w:val="Heading2"/>
       </w:pPr>
-      <w:bookmarkStart w:id="4" w:name="_Toc240624443"/>
+      <w:bookmarkStart w:id="4" w:name="_Toc240631031"/>
       <w:r>
         <w:lastRenderedPageBreak/>
         <w:t>2. Microservices, service boundaries, and data ownership</w:t>
@@ -2024,7 +2018,7 @@
       <w:pPr>
         <w:pStyle w:val="Heading3"/>
       </w:pPr>
-      <w:bookmarkStart w:id="5" w:name="_Toc240624444"/>
+      <w:bookmarkStart w:id="5" w:name="_Toc240631032"/>
       <w:r>
         <w:t>High cohesion and loose coupling</w:t>
       </w:r>
@@ -2179,7 +2173,7 @@
       <w:pPr>
         <w:pStyle w:val="Heading3"/>
       </w:pPr>
-      <w:bookmarkStart w:id="6" w:name="_Toc240624445"/>
+      <w:bookmarkStart w:id="6" w:name="_Toc240631033"/>
       <w:r>
         <w:t>Why companies accept microservice complexity</w:t>
       </w:r>
@@ -2230,7 +2224,7 @@
       <w:pPr>
         <w:pStyle w:val="Heading2"/>
       </w:pPr>
-      <w:bookmarkStart w:id="7" w:name="_Toc240624446"/>
+      <w:bookmarkStart w:id="7" w:name="_Toc240631034"/>
       <w:r>
         <w:t>3. Synchronous vs asynchronous communication</w:t>
       </w:r>
@@ -2299,7 +2293,7 @@
       <w:pPr>
         <w:pStyle w:val="Heading3"/>
       </w:pPr>
-      <w:bookmarkStart w:id="8" w:name="_Toc240624447"/>
+      <w:bookmarkStart w:id="8" w:name="_Toc240631035"/>
       <w:r>
         <w:t>Synchronous communication</w:t>
       </w:r>
@@ -2350,7 +2344,7 @@
       <w:pPr>
         <w:pStyle w:val="Heading3"/>
       </w:pPr>
-      <w:bookmarkStart w:id="9" w:name="_Toc240624448"/>
+      <w:bookmarkStart w:id="9" w:name="_Toc240631036"/>
       <w:r>
         <w:lastRenderedPageBreak/>
         <w:t>Asynchronous / event-driven communication</w:t>
@@ -2461,7 +2455,7 @@
       <w:pPr>
         <w:pStyle w:val="Heading3"/>
       </w:pPr>
-      <w:bookmarkStart w:id="10" w:name="_Toc240624449"/>
+      <w:bookmarkStart w:id="10" w:name="_Toc240631037"/>
       <w:r>
         <w:t>Commands vs events</w:t>
       </w:r>
@@ -2676,7 +2670,7 @@
       <w:pPr>
         <w:pStyle w:val="Heading2"/>
       </w:pPr>
-      <w:bookmarkStart w:id="11" w:name="_Toc240624450"/>
+      <w:bookmarkStart w:id="11" w:name="_Toc240631038"/>
       <w:r>
         <w:t>4. Reliability: networks fail</w:t>
       </w:r>
@@ -2741,7 +2735,7 @@
       <w:pPr>
         <w:pStyle w:val="Heading3"/>
       </w:pPr>
-      <w:bookmarkStart w:id="12" w:name="_Toc240624451"/>
+      <w:bookmarkStart w:id="12" w:name="_Toc240631039"/>
       <w:r>
         <w:t>Idempotency</w:t>
       </w:r>
@@ -2976,7 +2970,7 @@
       <w:pPr>
         <w:pStyle w:val="Heading3"/>
       </w:pPr>
-      <w:bookmarkStart w:id="13" w:name="_Toc240624452"/>
+      <w:bookmarkStart w:id="13" w:name="_Toc240631040"/>
       <w:r>
         <w:t>Retries, exponential backoff, and jitter</w:t>
       </w:r>
@@ -3286,7 +3280,7 @@
       <w:pPr>
         <w:pStyle w:val="Heading2"/>
       </w:pPr>
-      <w:bookmarkStart w:id="14" w:name="_Toc240624453"/>
+      <w:bookmarkStart w:id="14" w:name="_Toc240631041"/>
       <w:r>
         <w:lastRenderedPageBreak/>
         <w:t>5. Financial backend discipline</w:t>
@@ -3302,7 +3296,7 @@
       <w:pPr>
         <w:pStyle w:val="Heading3"/>
       </w:pPr>
-      <w:bookmarkStart w:id="15" w:name="_Toc240624454"/>
+      <w:bookmarkStart w:id="15" w:name="_Toc240631042"/>
       <w:r>
         <w:t>State machines</w:t>
       </w:r>
@@ -3407,7 +3401,7 @@
       <w:pPr>
         <w:pStyle w:val="Heading3"/>
       </w:pPr>
-      <w:bookmarkStart w:id="16" w:name="_Toc240624455"/>
+      <w:bookmarkStart w:id="16" w:name="_Toc240631043"/>
       <w:r>
         <w:t>Auditability and immutable history</w:t>
       </w:r>
@@ -3472,7 +3466,7 @@
       <w:pPr>
         <w:pStyle w:val="Heading3"/>
       </w:pPr>
-      <w:bookmarkStart w:id="17" w:name="_Toc240624456"/>
+      <w:bookmarkStart w:id="17" w:name="_Toc240631044"/>
       <w:r>
         <w:lastRenderedPageBreak/>
         <w:t>Reconciliation</w:t>
@@ -3520,7 +3514,7 @@
       <w:pPr>
         <w:pStyle w:val="Heading2"/>
       </w:pPr>
-      <w:bookmarkStart w:id="18" w:name="_Toc240624457"/>
+      <w:bookmarkStart w:id="18" w:name="_Toc240631045"/>
       <w:r>
         <w:t xml:space="preserve">6. </w:t>
       </w:r>

</xml_diff>